<commit_message>
Record converged chi128 matched-point comparison without an order verdict
Both preparations at p=.30486 pass the unchanged 1e-7 optimizer tolerance and prospective validation. Preserve old chi96 states, add symmetry-aligned fidelity and reproducible bounded-stage records, refresh 246-check receipt and review package. Publication is an owner-push handoff because ephemeral credentials are absent. No chi192 launched.
</commit_message>
<xml_diff>
--- a/research/transition-order/transition-order-report.docx
+++ b/research/transition-order/transition-order-report.docx
@@ -85,14 +85,14 @@
           <w:b/>
           <w:i w:val="0"/>
         </w:rPr>
-        <w:t>weak first order remains a preference, not a demonstrated verdict, and continuity is unresolved</w:t>
+        <w:t>transition order remains unresolved</w:t>
       </w:r>
       <w:r>
         <w:rPr>
           <w:b w:val="0"/>
           <w:i w:val="0"/>
         </w:rPr>
-        <w:t>. No latent heat, interface tension or asymptotic exponent is certified by this campaign. The standard n! algebra does not depend on n=3 being first order.</w:t>
+        <w:t>. The earlier weak-first-order preference is not a verdict and is not strengthened by the chi=96 optimizer failures. No latent heat, interface tension or asymptotic exponent is certified by this campaign. The standard n! algebra does not depend on n=3 being first order.</w:t>
       </w:r>
     </w:p>
     <w:p>
@@ -169,6 +169,36 @@
       </w:r>
     </w:p>
     <w:p>
+      <w:r>
+        <w:rPr>
+          <w:b/>
+          <w:i w:val="0"/>
+        </w:rPr>
+        <w:t>New accepted chi=128 comparison:</w:t>
+      </w:r>
+      <w:r>
+        <w:rPr>
+          <w:b w:val="0"/>
+          <w:i w:val="0"/>
+        </w:rPr>
+        <w:t xml:space="preserve"> both preparations passed the prospective gates at p=0.30486. m_species is 0.000284 / 0.003909, with xi_chi 59.56 / 62.49. Both solutions have small order diagnostics; a persistent large ordered/disordered branch separation was </w:t>
+      </w:r>
+      <w:r>
+        <w:rPr>
+          <w:b/>
+          <w:i w:val="0"/>
+        </w:rPr>
+        <w:t>not</w:t>
+      </w:r>
+      <w:r>
+        <w:rPr>
+          <w:b w:val="0"/>
+          <w:i w:val="0"/>
+        </w:rPr>
+        <w:t xml:space="preserve"> demonstrated at this probed point. This does not establish continuity: the point could lie on the same side of a first-order transition. The earlier common-rate chi=96 states were unconverged and had a shorter budget, so this comparison does not isolate a pure chi effect.</w:t>
+      </w:r>
+    </w:p>
+    <w:p>
       <w:pPr>
         <w:pStyle w:val="Heading2"/>
       </w:pPr>
@@ -195,14 +225,14 @@
           <w:b/>
           <w:i w:val="0"/>
         </w:rPr>
-        <w:t>Higher-chi ceiling:</w:t>
+        <w:t>Earlier resource-limited stages:</w:t>
       </w:r>
       <w:r>
         <w:rPr>
           <w:b w:val="0"/>
           <w:i w:val="0"/>
         </w:rPr>
-        <w:t xml:space="preserve"> the ordered chi=128 stage exhausted its resumed optimizer budget without convergence; the disordered chi=128 expansion was triaged before convergence. Both partial states are retained. Chi=192 was not launched. Compute was redirected to the more feasible matched-rate chi=96 test without relaxing its tolerance.</w:t>
+        <w:t xml:space="preserve"> the ordered chi=128 anchor exhausted its resumed optimizer budget without convergence; the disordered chi=128 anchor was triaged before convergence. Both partial states are retained. A separately authorized 90-minute common-rate chi=128 stage is recorded below. Chi=192 was not launched and is not automatic.</w:t>
       </w:r>
     </w:p>
     <w:tbl>
@@ -673,7 +703,7 @@
                 <w:i w:val="0"/>
                 <w:sz w:val="16"/>
               </w:rPr>
-              <w:t>0.3049000</w:t>
+              <w:t>0.3048600</w:t>
             </w:r>
           </w:p>
         </w:tc>
@@ -697,7 +727,7 @@
                 <w:i w:val="0"/>
                 <w:sz w:val="16"/>
               </w:rPr>
-              <w:t>96</w:t>
+              <w:t>128</w:t>
             </w:r>
           </w:p>
         </w:tc>
@@ -721,7 +751,7 @@
                 <w:i w:val="0"/>
                 <w:sz w:val="16"/>
               </w:rPr>
-              <w:t>0.9931902376</w:t>
+              <w:t>0.9930622737</w:t>
             </w:r>
           </w:p>
         </w:tc>
@@ -745,7 +775,7 @@
                 <w:i w:val="0"/>
                 <w:sz w:val="16"/>
               </w:rPr>
-              <w:t>0.00093 / 0.00343</w:t>
+              <w:t>0.00391 / 0.00284</w:t>
             </w:r>
           </w:p>
         </w:tc>
@@ -769,7 +799,7 @@
                 <w:i w:val="0"/>
                 <w:sz w:val="16"/>
               </w:rPr>
-              <w:t>47.80</w:t>
+              <w:t>62.49</w:t>
             </w:r>
           </w:p>
         </w:tc>
@@ -793,7 +823,7 @@
                 <w:i w:val="0"/>
                 <w:sz w:val="16"/>
               </w:rPr>
-              <w:t>9.51e-08</w:t>
+              <w:t>9.57e-08</w:t>
             </w:r>
           </w:p>
         </w:tc>
@@ -868,7 +898,7 @@
                 <w:i w:val="0"/>
                 <w:sz w:val="16"/>
               </w:rPr>
-              <w:t>0.3050000</w:t>
+              <w:t>0.3049000</w:t>
             </w:r>
           </w:p>
         </w:tc>
@@ -914,7 +944,7 @@
                 <w:i w:val="0"/>
                 <w:sz w:val="16"/>
               </w:rPr>
-              <w:t>0.9935068764</w:t>
+              <w:t>0.9931902376</w:t>
             </w:r>
           </w:p>
         </w:tc>
@@ -937,7 +967,7 @@
                 <w:i w:val="0"/>
                 <w:sz w:val="16"/>
               </w:rPr>
-              <w:t>0.00158 / 0.00110</w:t>
+              <w:t>0.00093 / 0.00343</w:t>
             </w:r>
           </w:p>
         </w:tc>
@@ -960,7 +990,7 @@
                 <w:i w:val="0"/>
                 <w:sz w:val="16"/>
               </w:rPr>
-              <w:t>43.78</w:t>
+              <w:t>47.80</w:t>
             </w:r>
           </w:p>
         </w:tc>
@@ -983,7 +1013,7 @@
                 <w:i w:val="0"/>
                 <w:sz w:val="16"/>
               </w:rPr>
-              <w:t>9.90e-08</w:t>
+              <w:t>9.51e-08</w:t>
             </w:r>
           </w:p>
         </w:tc>
@@ -1083,7 +1113,7 @@
                 <w:i w:val="0"/>
                 <w:sz w:val="16"/>
               </w:rPr>
-              <w:t>128</w:t>
+              <w:t>96</w:t>
             </w:r>
           </w:p>
         </w:tc>
@@ -1107,7 +1137,7 @@
                 <w:i w:val="0"/>
                 <w:sz w:val="16"/>
               </w:rPr>
-              <w:t>0.9935060214</w:t>
+              <w:t>0.9935068764</w:t>
             </w:r>
           </w:p>
         </w:tc>
@@ -1131,7 +1161,7 @@
                 <w:i w:val="0"/>
                 <w:sz w:val="16"/>
               </w:rPr>
-              <w:t>— / —</w:t>
+              <w:t>0.00158 / 0.00110</w:t>
             </w:r>
           </w:p>
         </w:tc>
@@ -1155,7 +1185,7 @@
                 <w:i w:val="0"/>
                 <w:sz w:val="16"/>
               </w:rPr>
-              <w:t>—</w:t>
+              <w:t>43.78</w:t>
             </w:r>
           </w:p>
         </w:tc>
@@ -1179,7 +1209,7 @@
                 <w:i w:val="0"/>
                 <w:sz w:val="16"/>
               </w:rPr>
-              <w:t>2.34e-05</w:t>
+              <w:t>9.90e-08</w:t>
             </w:r>
           </w:p>
         </w:tc>
@@ -1203,7 +1233,7 @@
                 <w:i w:val="0"/>
                 <w:sz w:val="16"/>
               </w:rPr>
-              <w:t>triage-stopped-unconverged</w:t>
+              <w:t>optimizer converged</w:t>
             </w:r>
           </w:p>
         </w:tc>
@@ -1254,7 +1284,7 @@
                 <w:i w:val="0"/>
                 <w:sz w:val="16"/>
               </w:rPr>
-              <w:t>0.3060000</w:t>
+              <w:t>0.3050000</w:t>
             </w:r>
           </w:p>
         </w:tc>
@@ -1277,7 +1307,7 @@
                 <w:i w:val="0"/>
                 <w:sz w:val="16"/>
               </w:rPr>
-              <w:t>48</w:t>
+              <w:t>128</w:t>
             </w:r>
           </w:p>
         </w:tc>
@@ -1300,7 +1330,7 @@
                 <w:i w:val="0"/>
                 <w:sz w:val="16"/>
               </w:rPr>
-              <w:t>0.9966619872</w:t>
+              <w:t>0.9935060214</w:t>
             </w:r>
           </w:p>
         </w:tc>
@@ -1323,7 +1353,7 @@
                 <w:i w:val="0"/>
                 <w:sz w:val="16"/>
               </w:rPr>
-              <w:t>0.00510 / 0.00488</w:t>
+              <w:t>— / —</w:t>
             </w:r>
           </w:p>
         </w:tc>
@@ -1346,7 +1376,7 @@
                 <w:i w:val="0"/>
                 <w:sz w:val="16"/>
               </w:rPr>
-              <w:t>18.93</w:t>
+              <w:t>—</w:t>
             </w:r>
           </w:p>
         </w:tc>
@@ -1369,7 +1399,7 @@
                 <w:i w:val="0"/>
                 <w:sz w:val="16"/>
               </w:rPr>
-              <w:t>2.11e-07</w:t>
+              <w:t>2.34e-05</w:t>
             </w:r>
           </w:p>
         </w:tc>
@@ -1392,7 +1422,7 @@
                 <w:i w:val="0"/>
                 <w:sz w:val="16"/>
               </w:rPr>
-              <w:t>unconverged</w:t>
+              <w:t>triage-stopped-unconverged</w:t>
             </w:r>
           </w:p>
         </w:tc>
@@ -1469,7 +1499,7 @@
                 <w:i w:val="0"/>
                 <w:sz w:val="16"/>
               </w:rPr>
-              <w:t>72</w:t>
+              <w:t>48</w:t>
             </w:r>
           </w:p>
         </w:tc>
@@ -1493,7 +1523,7 @@
                 <w:i w:val="0"/>
                 <w:sz w:val="16"/>
               </w:rPr>
-              <w:t>0.9966563741</w:t>
+              <w:t>0.9966619872</w:t>
             </w:r>
           </w:p>
         </w:tc>
@@ -1517,7 +1547,7 @@
                 <w:i w:val="0"/>
                 <w:sz w:val="16"/>
               </w:rPr>
-              <w:t>— / —</w:t>
+              <w:t>0.00510 / 0.00488</w:t>
             </w:r>
           </w:p>
         </w:tc>
@@ -1541,7 +1571,7 @@
                 <w:i w:val="0"/>
                 <w:sz w:val="16"/>
               </w:rPr>
-              <w:t>—</w:t>
+              <w:t>18.93</w:t>
             </w:r>
           </w:p>
         </w:tc>
@@ -1565,7 +1595,7 @@
                 <w:i w:val="0"/>
                 <w:sz w:val="16"/>
               </w:rPr>
-              <w:t>1.04e-07</w:t>
+              <w:t>2.11e-07</w:t>
             </w:r>
           </w:p>
         </w:tc>
@@ -1589,7 +1619,7 @@
                 <w:i w:val="0"/>
                 <w:sz w:val="16"/>
               </w:rPr>
-              <w:t>plateau-stopped-unconverged</w:t>
+              <w:t>unconverged</w:t>
             </w:r>
           </w:p>
         </w:tc>
@@ -1617,7 +1647,7 @@
                 <w:i w:val="0"/>
                 <w:sz w:val="16"/>
               </w:rPr>
-              <w:t>ordered</w:t>
+              <w:t>disordered</w:t>
             </w:r>
           </w:p>
         </w:tc>
@@ -1640,7 +1670,7 @@
                 <w:i w:val="0"/>
                 <w:sz w:val="16"/>
               </w:rPr>
-              <w:t>0.3045000</w:t>
+              <w:t>0.3060000</w:t>
             </w:r>
           </w:p>
         </w:tc>
@@ -1663,7 +1693,7 @@
                 <w:i w:val="0"/>
                 <w:sz w:val="16"/>
               </w:rPr>
-              <w:t>48</w:t>
+              <w:t>72</w:t>
             </w:r>
           </w:p>
         </w:tc>
@@ -1686,7 +1716,7 @@
                 <w:i w:val="0"/>
                 <w:sz w:val="16"/>
               </w:rPr>
-              <w:t>0.9918959919</w:t>
+              <w:t>0.9966563741</w:t>
             </w:r>
           </w:p>
         </w:tc>
@@ -1709,7 +1739,7 @@
                 <w:i w:val="0"/>
                 <w:sz w:val="16"/>
               </w:rPr>
-              <w:t>0.60019 / 0.42063</w:t>
+              <w:t>— / —</w:t>
             </w:r>
           </w:p>
         </w:tc>
@@ -1732,7 +1762,7 @@
                 <w:i w:val="0"/>
                 <w:sz w:val="16"/>
               </w:rPr>
-              <w:t>18.86</w:t>
+              <w:t>—</w:t>
             </w:r>
           </w:p>
         </w:tc>
@@ -1755,7 +1785,7 @@
                 <w:i w:val="0"/>
                 <w:sz w:val="16"/>
               </w:rPr>
-              <w:t>9.97e-08</w:t>
+              <w:t>1.04e-07</w:t>
             </w:r>
           </w:p>
         </w:tc>
@@ -1778,7 +1808,7 @@
                 <w:i w:val="0"/>
                 <w:sz w:val="16"/>
               </w:rPr>
-              <w:t>optimizer converged</w:t>
+              <w:t>plateau-stopped-unconverged</w:t>
             </w:r>
           </w:p>
         </w:tc>
@@ -1831,7 +1861,7 @@
                 <w:i w:val="0"/>
                 <w:sz w:val="16"/>
               </w:rPr>
-              <w:t>0.3048000</w:t>
+              <w:t>0.3045000</w:t>
             </w:r>
           </w:p>
         </w:tc>
@@ -1879,7 +1909,7 @@
                 <w:i w:val="0"/>
                 <w:sz w:val="16"/>
               </w:rPr>
-              <w:t>0.9928717674</w:t>
+              <w:t>0.9918959919</w:t>
             </w:r>
           </w:p>
         </w:tc>
@@ -1903,7 +1933,7 @@
                 <w:i w:val="0"/>
                 <w:sz w:val="16"/>
               </w:rPr>
-              <w:t>0.56060 / 0.38327</w:t>
+              <w:t>0.60019 / 0.42063</w:t>
             </w:r>
           </w:p>
         </w:tc>
@@ -1927,7 +1957,7 @@
                 <w:i w:val="0"/>
                 <w:sz w:val="16"/>
               </w:rPr>
-              <w:t>23.74</w:t>
+              <w:t>18.86</w:t>
             </w:r>
           </w:p>
         </w:tc>
@@ -1951,7 +1981,7 @@
                 <w:i w:val="0"/>
                 <w:sz w:val="16"/>
               </w:rPr>
-              <w:t>9.16e-08</w:t>
+              <w:t>9.97e-08</w:t>
             </w:r>
           </w:p>
         </w:tc>
@@ -2049,7 +2079,7 @@
                 <w:i w:val="0"/>
                 <w:sz w:val="16"/>
               </w:rPr>
-              <w:t>72</w:t>
+              <w:t>48</w:t>
             </w:r>
           </w:p>
         </w:tc>
@@ -2072,7 +2102,7 @@
                 <w:i w:val="0"/>
                 <w:sz w:val="16"/>
               </w:rPr>
-              <w:t>0.9928704222</w:t>
+              <w:t>0.9928717674</w:t>
             </w:r>
           </w:p>
         </w:tc>
@@ -2095,7 +2125,7 @@
                 <w:i w:val="0"/>
                 <w:sz w:val="16"/>
               </w:rPr>
-              <w:t>0.53897 / 0.36473</w:t>
+              <w:t>0.56060 / 0.38327</w:t>
             </w:r>
           </w:p>
         </w:tc>
@@ -2118,7 +2148,7 @@
                 <w:i w:val="0"/>
                 <w:sz w:val="16"/>
               </w:rPr>
-              <w:t>38.52</w:t>
+              <w:t>23.74</w:t>
             </w:r>
           </w:p>
         </w:tc>
@@ -2141,7 +2171,7 @@
                 <w:i w:val="0"/>
                 <w:sz w:val="16"/>
               </w:rPr>
-              <w:t>9.59e-08</w:t>
+              <w:t>9.16e-08</w:t>
             </w:r>
           </w:p>
         </w:tc>
@@ -2241,7 +2271,7 @@
                 <w:i w:val="0"/>
                 <w:sz w:val="16"/>
               </w:rPr>
-              <w:t>96</w:t>
+              <w:t>72</w:t>
             </w:r>
           </w:p>
         </w:tc>
@@ -2265,7 +2295,7 @@
                 <w:i w:val="0"/>
                 <w:sz w:val="16"/>
               </w:rPr>
-              <w:t>0.9928700670</w:t>
+              <w:t>0.9928704222</w:t>
             </w:r>
           </w:p>
         </w:tc>
@@ -2289,7 +2319,7 @@
                 <w:i w:val="0"/>
                 <w:sz w:val="16"/>
               </w:rPr>
-              <w:t>0.52769 / 0.35536</w:t>
+              <w:t>0.53897 / 0.36473</w:t>
             </w:r>
           </w:p>
         </w:tc>
@@ -2313,7 +2343,7 @@
                 <w:i w:val="0"/>
                 <w:sz w:val="16"/>
               </w:rPr>
-              <w:t>53.20</w:t>
+              <w:t>38.52</w:t>
             </w:r>
           </w:p>
         </w:tc>
@@ -2337,7 +2367,7 @@
                 <w:i w:val="0"/>
                 <w:sz w:val="16"/>
               </w:rPr>
-              <w:t>9.81e-08</w:t>
+              <w:t>9.59e-08</w:t>
             </w:r>
           </w:p>
         </w:tc>
@@ -2435,7 +2465,7 @@
                 <w:i w:val="0"/>
                 <w:sz w:val="16"/>
               </w:rPr>
-              <w:t>128</w:t>
+              <w:t>96</w:t>
             </w:r>
           </w:p>
         </w:tc>
@@ -2458,7 +2488,7 @@
                 <w:i w:val="0"/>
                 <w:sz w:val="16"/>
               </w:rPr>
-              <w:t>0.9928698856</w:t>
+              <w:t>0.9928700670</w:t>
             </w:r>
           </w:p>
         </w:tc>
@@ -2481,7 +2511,7 @@
                 <w:i w:val="0"/>
                 <w:sz w:val="16"/>
               </w:rPr>
-              <w:t>— / —</w:t>
+              <w:t>0.52769 / 0.35536</w:t>
             </w:r>
           </w:p>
         </w:tc>
@@ -2504,7 +2534,7 @@
                 <w:i w:val="0"/>
                 <w:sz w:val="16"/>
               </w:rPr>
-              <w:t>—</w:t>
+              <w:t>53.20</w:t>
             </w:r>
           </w:p>
         </w:tc>
@@ -2527,7 +2557,7 @@
                 <w:i w:val="0"/>
                 <w:sz w:val="16"/>
               </w:rPr>
-              <w:t>1.15e-06</w:t>
+              <w:t>9.81e-08</w:t>
             </w:r>
           </w:p>
         </w:tc>
@@ -2550,7 +2580,7 @@
                 <w:i w:val="0"/>
                 <w:sz w:val="16"/>
               </w:rPr>
-              <w:t>budget-stopped</w:t>
+              <w:t>optimizer converged</w:t>
             </w:r>
           </w:p>
         </w:tc>
@@ -2603,7 +2633,7 @@
                 <w:i w:val="0"/>
                 <w:sz w:val="16"/>
               </w:rPr>
-              <w:t>0.3048600</w:t>
+              <w:t>0.3048000</w:t>
             </w:r>
           </w:p>
         </w:tc>
@@ -2627,7 +2657,7 @@
                 <w:i w:val="0"/>
                 <w:sz w:val="16"/>
               </w:rPr>
-              <w:t>96</w:t>
+              <w:t>128</w:t>
             </w:r>
           </w:p>
         </w:tc>
@@ -2651,7 +2681,7 @@
                 <w:i w:val="0"/>
                 <w:sz w:val="16"/>
               </w:rPr>
-              <w:t>0.9930640344</w:t>
+              <w:t>0.9928698856</w:t>
             </w:r>
           </w:p>
         </w:tc>
@@ -2723,7 +2753,7 @@
                 <w:i w:val="0"/>
                 <w:sz w:val="16"/>
               </w:rPr>
-              <w:t>8.75e-07</w:t>
+              <w:t>1.15e-06</w:t>
             </w:r>
           </w:p>
         </w:tc>
@@ -2748,6 +2778,392 @@
                 <w:sz w:val="16"/>
               </w:rPr>
               <w:t>budget-stopped</w:t>
+            </w:r>
+          </w:p>
+        </w:tc>
+      </w:tr>
+      <w:tr>
+        <w:trPr>
+          <w:cantSplit/>
+        </w:trPr>
+        <w:tc>
+          <w:tcPr>
+            <w:tcW w:type="dxa" w:w="1218"/>
+          </w:tcPr>
+          <w:p>
+            <w:pPr>
+              <w:spacing w:after="40"/>
+            </w:pPr>
+            <w:r>
+              <w:rPr>
+                <w:sz w:val="16"/>
+              </w:rPr>
+            </w:r>
+            <w:r>
+              <w:rPr>
+                <w:b w:val="0"/>
+                <w:i w:val="0"/>
+                <w:sz w:val="16"/>
+              </w:rPr>
+              <w:t>ordered</w:t>
+            </w:r>
+          </w:p>
+        </w:tc>
+        <w:tc>
+          <w:tcPr>
+            <w:tcW w:type="dxa" w:w="1218"/>
+          </w:tcPr>
+          <w:p>
+            <w:pPr>
+              <w:spacing w:after="40"/>
+            </w:pPr>
+            <w:r>
+              <w:rPr>
+                <w:sz w:val="16"/>
+              </w:rPr>
+            </w:r>
+            <w:r>
+              <w:rPr>
+                <w:b w:val="0"/>
+                <w:i w:val="0"/>
+                <w:sz w:val="16"/>
+              </w:rPr>
+              <w:t>0.3048600</w:t>
+            </w:r>
+          </w:p>
+        </w:tc>
+        <w:tc>
+          <w:tcPr>
+            <w:tcW w:type="dxa" w:w="1218"/>
+          </w:tcPr>
+          <w:p>
+            <w:pPr>
+              <w:spacing w:after="40"/>
+            </w:pPr>
+            <w:r>
+              <w:rPr>
+                <w:sz w:val="16"/>
+              </w:rPr>
+            </w:r>
+            <w:r>
+              <w:rPr>
+                <w:b w:val="0"/>
+                <w:i w:val="0"/>
+                <w:sz w:val="16"/>
+              </w:rPr>
+              <w:t>96</w:t>
+            </w:r>
+          </w:p>
+        </w:tc>
+        <w:tc>
+          <w:tcPr>
+            <w:tcW w:type="dxa" w:w="1218"/>
+          </w:tcPr>
+          <w:p>
+            <w:pPr>
+              <w:spacing w:after="40"/>
+            </w:pPr>
+            <w:r>
+              <w:rPr>
+                <w:sz w:val="16"/>
+              </w:rPr>
+            </w:r>
+            <w:r>
+              <w:rPr>
+                <w:b w:val="0"/>
+                <w:i w:val="0"/>
+                <w:sz w:val="16"/>
+              </w:rPr>
+              <w:t>0.9930640344</w:t>
+            </w:r>
+          </w:p>
+        </w:tc>
+        <w:tc>
+          <w:tcPr>
+            <w:tcW w:type="dxa" w:w="1218"/>
+          </w:tcPr>
+          <w:p>
+            <w:pPr>
+              <w:spacing w:after="40"/>
+            </w:pPr>
+            <w:r>
+              <w:rPr>
+                <w:sz w:val="16"/>
+              </w:rPr>
+            </w:r>
+            <w:r>
+              <w:rPr>
+                <w:b w:val="0"/>
+                <w:i w:val="0"/>
+                <w:sz w:val="16"/>
+              </w:rPr>
+              <w:t>— / —</w:t>
+            </w:r>
+          </w:p>
+        </w:tc>
+        <w:tc>
+          <w:tcPr>
+            <w:tcW w:type="dxa" w:w="1218"/>
+          </w:tcPr>
+          <w:p>
+            <w:pPr>
+              <w:spacing w:after="40"/>
+            </w:pPr>
+            <w:r>
+              <w:rPr>
+                <w:sz w:val="16"/>
+              </w:rPr>
+            </w:r>
+            <w:r>
+              <w:rPr>
+                <w:b w:val="0"/>
+                <w:i w:val="0"/>
+                <w:sz w:val="16"/>
+              </w:rPr>
+              <w:t>—</w:t>
+            </w:r>
+          </w:p>
+        </w:tc>
+        <w:tc>
+          <w:tcPr>
+            <w:tcW w:type="dxa" w:w="1218"/>
+          </w:tcPr>
+          <w:p>
+            <w:pPr>
+              <w:spacing w:after="40"/>
+            </w:pPr>
+            <w:r>
+              <w:rPr>
+                <w:sz w:val="16"/>
+              </w:rPr>
+            </w:r>
+            <w:r>
+              <w:rPr>
+                <w:b w:val="0"/>
+                <w:i w:val="0"/>
+                <w:sz w:val="16"/>
+              </w:rPr>
+              <w:t>8.75e-07</w:t>
+            </w:r>
+          </w:p>
+        </w:tc>
+        <w:tc>
+          <w:tcPr>
+            <w:tcW w:type="dxa" w:w="1218"/>
+          </w:tcPr>
+          <w:p>
+            <w:pPr>
+              <w:spacing w:after="40"/>
+            </w:pPr>
+            <w:r>
+              <w:rPr>
+                <w:sz w:val="16"/>
+              </w:rPr>
+            </w:r>
+            <w:r>
+              <w:rPr>
+                <w:b w:val="0"/>
+                <w:i w:val="0"/>
+                <w:sz w:val="16"/>
+              </w:rPr>
+              <w:t>budget-stopped</w:t>
+            </w:r>
+          </w:p>
+        </w:tc>
+      </w:tr>
+      <w:tr>
+        <w:trPr>
+          <w:cantSplit/>
+        </w:trPr>
+        <w:tc>
+          <w:tcPr>
+            <w:tcW w:type="dxa" w:w="1218"/>
+            <w:shd w:val="clear" w:color="auto" w:fill="F5F7FA"/>
+          </w:tcPr>
+          <w:p>
+            <w:pPr>
+              <w:spacing w:after="40"/>
+            </w:pPr>
+            <w:r>
+              <w:rPr>
+                <w:sz w:val="16"/>
+              </w:rPr>
+            </w:r>
+            <w:r>
+              <w:rPr>
+                <w:b w:val="0"/>
+                <w:i w:val="0"/>
+                <w:sz w:val="16"/>
+              </w:rPr>
+              <w:t>ordered</w:t>
+            </w:r>
+          </w:p>
+        </w:tc>
+        <w:tc>
+          <w:tcPr>
+            <w:tcW w:type="dxa" w:w="1218"/>
+            <w:shd w:val="clear" w:color="auto" w:fill="F5F7FA"/>
+          </w:tcPr>
+          <w:p>
+            <w:pPr>
+              <w:spacing w:after="40"/>
+            </w:pPr>
+            <w:r>
+              <w:rPr>
+                <w:sz w:val="16"/>
+              </w:rPr>
+            </w:r>
+            <w:r>
+              <w:rPr>
+                <w:b w:val="0"/>
+                <w:i w:val="0"/>
+                <w:sz w:val="16"/>
+              </w:rPr>
+              <w:t>0.3048600</w:t>
+            </w:r>
+          </w:p>
+        </w:tc>
+        <w:tc>
+          <w:tcPr>
+            <w:tcW w:type="dxa" w:w="1218"/>
+            <w:shd w:val="clear" w:color="auto" w:fill="F5F7FA"/>
+          </w:tcPr>
+          <w:p>
+            <w:pPr>
+              <w:spacing w:after="40"/>
+            </w:pPr>
+            <w:r>
+              <w:rPr>
+                <w:sz w:val="16"/>
+              </w:rPr>
+            </w:r>
+            <w:r>
+              <w:rPr>
+                <w:b w:val="0"/>
+                <w:i w:val="0"/>
+                <w:sz w:val="16"/>
+              </w:rPr>
+              <w:t>128</w:t>
+            </w:r>
+          </w:p>
+        </w:tc>
+        <w:tc>
+          <w:tcPr>
+            <w:tcW w:type="dxa" w:w="1218"/>
+            <w:shd w:val="clear" w:color="auto" w:fill="F5F7FA"/>
+          </w:tcPr>
+          <w:p>
+            <w:pPr>
+              <w:spacing w:after="40"/>
+            </w:pPr>
+            <w:r>
+              <w:rPr>
+                <w:sz w:val="16"/>
+              </w:rPr>
+            </w:r>
+            <w:r>
+              <w:rPr>
+                <w:b w:val="0"/>
+                <w:i w:val="0"/>
+                <w:sz w:val="16"/>
+              </w:rPr>
+              <w:t>0.9930622853</w:t>
+            </w:r>
+          </w:p>
+        </w:tc>
+        <w:tc>
+          <w:tcPr>
+            <w:tcW w:type="dxa" w:w="1218"/>
+            <w:shd w:val="clear" w:color="auto" w:fill="F5F7FA"/>
+          </w:tcPr>
+          <w:p>
+            <w:pPr>
+              <w:spacing w:after="40"/>
+            </w:pPr>
+            <w:r>
+              <w:rPr>
+                <w:sz w:val="16"/>
+              </w:rPr>
+            </w:r>
+            <w:r>
+              <w:rPr>
+                <w:b w:val="0"/>
+                <w:i w:val="0"/>
+                <w:sz w:val="16"/>
+              </w:rPr>
+              <w:t>0.00028 / 0.00000</w:t>
+            </w:r>
+          </w:p>
+        </w:tc>
+        <w:tc>
+          <w:tcPr>
+            <w:tcW w:type="dxa" w:w="1218"/>
+            <w:shd w:val="clear" w:color="auto" w:fill="F5F7FA"/>
+          </w:tcPr>
+          <w:p>
+            <w:pPr>
+              <w:spacing w:after="40"/>
+            </w:pPr>
+            <w:r>
+              <w:rPr>
+                <w:sz w:val="16"/>
+              </w:rPr>
+            </w:r>
+            <w:r>
+              <w:rPr>
+                <w:b w:val="0"/>
+                <w:i w:val="0"/>
+                <w:sz w:val="16"/>
+              </w:rPr>
+              <w:t>59.56</w:t>
+            </w:r>
+          </w:p>
+        </w:tc>
+        <w:tc>
+          <w:tcPr>
+            <w:tcW w:type="dxa" w:w="1218"/>
+            <w:shd w:val="clear" w:color="auto" w:fill="F5F7FA"/>
+          </w:tcPr>
+          <w:p>
+            <w:pPr>
+              <w:spacing w:after="40"/>
+            </w:pPr>
+            <w:r>
+              <w:rPr>
+                <w:sz w:val="16"/>
+              </w:rPr>
+            </w:r>
+            <w:r>
+              <w:rPr>
+                <w:b w:val="0"/>
+                <w:i w:val="0"/>
+                <w:sz w:val="16"/>
+              </w:rPr>
+              <w:t>9.99e-08</w:t>
+            </w:r>
+          </w:p>
+        </w:tc>
+        <w:tc>
+          <w:tcPr>
+            <w:tcW w:type="dxa" w:w="1218"/>
+            <w:shd w:val="clear" w:color="auto" w:fill="F5F7FA"/>
+          </w:tcPr>
+          <w:p>
+            <w:pPr>
+              <w:spacing w:after="40"/>
+            </w:pPr>
+            <w:r>
+              <w:rPr>
+                <w:sz w:val="16"/>
+              </w:rPr>
+            </w:r>
+            <w:r>
+              <w:rPr>
+                <w:b w:val="0"/>
+                <w:i w:val="0"/>
+                <w:sz w:val="16"/>
+              </w:rPr>
+              <w:t>optimizer converged</w:t>
             </w:r>
           </w:p>
         </w:tc>
@@ -2803,14 +3219,1495 @@
         <w:t>Matched-rate comparisons</w:t>
       </w:r>
     </w:p>
+    <w:tbl>
+      <w:tblPr>
+        <w:tblW w:type="auto" w:w="0"/>
+        <w:jc w:val="center"/>
+        <w:tblLayout w:type="autofit"/>
+        <w:tblLook w:firstColumn="1" w:firstRow="1" w:lastColumn="0" w:lastRow="0" w:noHBand="0" w:noVBand="1" w:val="04A0"/>
+        <w:tblBorders>
+          <w:top w:val="single" w:sz="4" w:space="0" w:color="999999"/>
+          <w:left w:val="single" w:sz="4" w:space="0" w:color="999999"/>
+          <w:bottom w:val="single" w:sz="4" w:space="0" w:color="999999"/>
+          <w:right w:val="single" w:sz="4" w:space="0" w:color="999999"/>
+          <w:insideH w:val="single" w:sz="4" w:space="0" w:color="999999"/>
+          <w:insideV w:val="single" w:sz="4" w:space="0" w:color="999999"/>
+        </w:tblBorders>
+      </w:tblPr>
+      <w:tblGrid>
+        <w:gridCol w:w="1624"/>
+        <w:gridCol w:w="1624"/>
+        <w:gridCol w:w="1624"/>
+        <w:gridCol w:w="1624"/>
+        <w:gridCol w:w="1624"/>
+        <w:gridCol w:w="1624"/>
+      </w:tblGrid>
+      <w:tr>
+        <w:trPr>
+          <w:cantSplit/>
+          <w:tblHeader/>
+        </w:trPr>
+        <w:tc>
+          <w:tcPr>
+            <w:tcW w:type="dxa" w:w="1624"/>
+            <w:shd w:val="clear" w:color="auto" w:fill="E8ECF2"/>
+            <w:shd w:val="clear" w:color="auto" w:fill="E6EEF5"/>
+          </w:tcPr>
+          <w:p>
+            <w:pPr>
+              <w:spacing w:after="40"/>
+            </w:pPr>
+            <w:r>
+              <w:rPr>
+                <w:sz w:val="17"/>
+              </w:rPr>
+            </w:r>
+            <w:r>
+              <w:rPr>
+                <w:b/>
+                <w:i w:val="0"/>
+                <w:sz w:val="17"/>
+              </w:rPr>
+              <w:t>p</w:t>
+            </w:r>
+          </w:p>
+        </w:tc>
+        <w:tc>
+          <w:tcPr>
+            <w:tcW w:type="dxa" w:w="1624"/>
+            <w:shd w:val="clear" w:color="auto" w:fill="E8ECF2"/>
+            <w:shd w:val="clear" w:color="auto" w:fill="E6EEF5"/>
+          </w:tcPr>
+          <w:p>
+            <w:pPr>
+              <w:spacing w:after="40"/>
+            </w:pPr>
+            <w:r>
+              <w:rPr>
+                <w:sz w:val="17"/>
+              </w:rPr>
+            </w:r>
+            <w:r>
+              <w:rPr>
+                <w:b/>
+                <w:i w:val="0"/>
+                <w:sz w:val="17"/>
+              </w:rPr>
+              <w:t>chi</w:t>
+            </w:r>
+          </w:p>
+        </w:tc>
+        <w:tc>
+          <w:tcPr>
+            <w:tcW w:type="dxa" w:w="1624"/>
+            <w:shd w:val="clear" w:color="auto" w:fill="E8ECF2"/>
+            <w:shd w:val="clear" w:color="auto" w:fill="E6EEF5"/>
+          </w:tcPr>
+          <w:p>
+            <w:pPr>
+              <w:spacing w:after="40"/>
+            </w:pPr>
+            <w:r>
+              <w:rPr>
+                <w:sz w:val="17"/>
+              </w:rPr>
+            </w:r>
+            <w:r>
+              <w:rPr>
+                <w:b/>
+                <w:i w:val="0"/>
+                <w:sz w:val="17"/>
+              </w:rPr>
+              <w:t>f_half,O − f_half,D</w:t>
+            </w:r>
+          </w:p>
+        </w:tc>
+        <w:tc>
+          <w:tcPr>
+            <w:tcW w:type="dxa" w:w="1624"/>
+            <w:shd w:val="clear" w:color="auto" w:fill="E8ECF2"/>
+            <w:shd w:val="clear" w:color="auto" w:fill="E6EEF5"/>
+          </w:tcPr>
+          <w:p>
+            <w:pPr>
+              <w:spacing w:after="40"/>
+            </w:pPr>
+            <w:r>
+              <w:rPr>
+                <w:sz w:val="17"/>
+              </w:rPr>
+            </w:r>
+            <w:r>
+              <w:rPr>
+                <w:b/>
+                <w:i w:val="0"/>
+                <w:sz w:val="17"/>
+              </w:rPr>
+              <w:t>m_species O / D</w:t>
+            </w:r>
+          </w:p>
+        </w:tc>
+        <w:tc>
+          <w:tcPr>
+            <w:tcW w:type="dxa" w:w="1624"/>
+            <w:shd w:val="clear" w:color="auto" w:fill="E8ECF2"/>
+            <w:shd w:val="clear" w:color="auto" w:fill="E6EEF5"/>
+          </w:tcPr>
+          <w:p>
+            <w:pPr>
+              <w:spacing w:after="40"/>
+            </w:pPr>
+            <w:r>
+              <w:rPr>
+                <w:sz w:val="17"/>
+              </w:rPr>
+            </w:r>
+            <w:r>
+              <w:rPr>
+                <w:b/>
+                <w:i w:val="0"/>
+                <w:sz w:val="17"/>
+              </w:rPr>
+              <w:t>abs(m_parity) O / D</w:t>
+            </w:r>
+          </w:p>
+        </w:tc>
+        <w:tc>
+          <w:tcPr>
+            <w:tcW w:type="dxa" w:w="1624"/>
+            <w:shd w:val="clear" w:color="auto" w:fill="E8ECF2"/>
+            <w:shd w:val="clear" w:color="auto" w:fill="E6EEF5"/>
+          </w:tcPr>
+          <w:p>
+            <w:pPr>
+              <w:spacing w:after="40"/>
+            </w:pPr>
+            <w:r>
+              <w:rPr>
+                <w:sz w:val="17"/>
+              </w:rPr>
+            </w:r>
+            <w:r>
+              <w:rPr>
+                <w:b/>
+                <w:i w:val="0"/>
+                <w:sz w:val="17"/>
+              </w:rPr>
+              <w:t>xi O / D</w:t>
+            </w:r>
+          </w:p>
+        </w:tc>
+      </w:tr>
+      <w:tr>
+        <w:trPr>
+          <w:cantSplit/>
+        </w:trPr>
+        <w:tc>
+          <w:tcPr>
+            <w:tcW w:type="dxa" w:w="1624"/>
+          </w:tcPr>
+          <w:p>
+            <w:pPr>
+              <w:spacing w:after="40"/>
+            </w:pPr>
+            <w:r>
+              <w:rPr>
+                <w:sz w:val="17"/>
+              </w:rPr>
+            </w:r>
+            <w:r>
+              <w:rPr>
+                <w:b w:val="0"/>
+                <w:i w:val="0"/>
+                <w:sz w:val="17"/>
+              </w:rPr>
+              <w:t>0.3048600</w:t>
+            </w:r>
+          </w:p>
+        </w:tc>
+        <w:tc>
+          <w:tcPr>
+            <w:tcW w:type="dxa" w:w="1624"/>
+          </w:tcPr>
+          <w:p>
+            <w:pPr>
+              <w:spacing w:after="40"/>
+            </w:pPr>
+            <w:r>
+              <w:rPr>
+                <w:sz w:val="17"/>
+              </w:rPr>
+            </w:r>
+            <w:r>
+              <w:rPr>
+                <w:b w:val="0"/>
+                <w:i w:val="0"/>
+                <w:sz w:val="17"/>
+              </w:rPr>
+              <w:t>128</w:t>
+            </w:r>
+          </w:p>
+        </w:tc>
+        <w:tc>
+          <w:tcPr>
+            <w:tcW w:type="dxa" w:w="1624"/>
+          </w:tcPr>
+          <w:p>
+            <w:pPr>
+              <w:spacing w:after="40"/>
+            </w:pPr>
+            <w:r>
+              <w:rPr>
+                <w:sz w:val="17"/>
+              </w:rPr>
+            </w:r>
+            <w:r>
+              <w:rPr>
+                <w:b w:val="0"/>
+                <w:i w:val="0"/>
+                <w:sz w:val="17"/>
+              </w:rPr>
+              <w:t>1.156e-08</w:t>
+            </w:r>
+          </w:p>
+        </w:tc>
+        <w:tc>
+          <w:tcPr>
+            <w:tcW w:type="dxa" w:w="1624"/>
+          </w:tcPr>
+          <w:p>
+            <w:pPr>
+              <w:spacing w:after="40"/>
+            </w:pPr>
+            <w:r>
+              <w:rPr>
+                <w:sz w:val="17"/>
+              </w:rPr>
+            </w:r>
+            <w:r>
+              <w:rPr>
+                <w:b w:val="0"/>
+                <w:i w:val="0"/>
+                <w:sz w:val="17"/>
+              </w:rPr>
+              <w:t>0.00028 / 0.00391</w:t>
+            </w:r>
+          </w:p>
+        </w:tc>
+        <w:tc>
+          <w:tcPr>
+            <w:tcW w:type="dxa" w:w="1624"/>
+          </w:tcPr>
+          <w:p>
+            <w:pPr>
+              <w:spacing w:after="40"/>
+            </w:pPr>
+            <w:r>
+              <w:rPr>
+                <w:sz w:val="17"/>
+              </w:rPr>
+            </w:r>
+            <w:r>
+              <w:rPr>
+                <w:b w:val="0"/>
+                <w:i w:val="0"/>
+                <w:sz w:val="17"/>
+              </w:rPr>
+              <w:t>0.00000 / 0.00284</w:t>
+            </w:r>
+          </w:p>
+        </w:tc>
+        <w:tc>
+          <w:tcPr>
+            <w:tcW w:type="dxa" w:w="1624"/>
+          </w:tcPr>
+          <w:p>
+            <w:pPr>
+              <w:spacing w:after="40"/>
+            </w:pPr>
+            <w:r>
+              <w:rPr>
+                <w:sz w:val="17"/>
+              </w:rPr>
+            </w:r>
+            <w:r>
+              <w:rPr>
+                <w:b w:val="0"/>
+                <w:i w:val="0"/>
+                <w:sz w:val="17"/>
+              </w:rPr>
+              <w:t>59.56 / 62.49</w:t>
+            </w:r>
+          </w:p>
+        </w:tc>
+      </w:tr>
+    </w:tbl>
+    <w:p>
+      <w:pPr>
+        <w:spacing w:after="80"/>
+      </w:pPr>
+    </w:p>
     <w:p>
       <w:r>
         <w:rPr>
           <w:b w:val="0"/>
           <w:i w:val="0"/>
         </w:rPr>
-        <w:t>No pair has yet passed both optimizer tolerances at exactly the same p and chi. A partial checkpoint is not substituted into that comparison.</w:t>
+        <w:t>These are finite-chi variational comparisons. Agreement/merger at a single p does not establish continuity; different stationary states at one chi do not establish first order. Rate tuning, free-energy systematics, slope/jump convergence and correlation-length behavior remain necessary.</w:t>
       </w:r>
+    </w:p>
+    <w:p>
+      <w:pPr>
+        <w:pStyle w:val="Heading3"/>
+      </w:pPr>
+      <w:r>
+        <w:rPr>
+          <w:b w:val="0"/>
+          <w:i w:val="0"/>
+        </w:rPr>
+        <w:t>Authorized 90-minute chi=128 stage</w:t>
+      </w:r>
+    </w:p>
+    <w:p>
+      <w:r>
+        <w:rPr>
+          <w:b w:val="0"/>
+          <w:i w:val="0"/>
+        </w:rPr>
+        <w:t xml:space="preserve">The user authorized one bounded two-preparation chi=128 stage at p=.30486, not another chi=96 campaign. The original 1e-7 tolerance and optimizer are unchanged. Left/right compatibility, canonical identities and a same-period contraction are additionally validated. See </w:t>
+      </w:r>
+      <w:hyperlink r:id="rId14">
+        <w:r>
+          <w:rPr>
+            <w:color w:val="176A9E"/>
+            <w:u w:val="single"/>
+          </w:rPr>
+          <w:t>prospective protocol</w:t>
+        </w:r>
+      </w:hyperlink>
+      <w:r>
+        <w:rPr>
+          <w:b w:val="0"/>
+          <w:i w:val="0"/>
+        </w:rPr>
+        <w:t xml:space="preserve"> and </w:t>
+      </w:r>
+      <w:hyperlink r:id="rId15">
+        <w:r>
+          <w:rPr>
+            <w:color w:val="176A9E"/>
+            <w:u w:val="single"/>
+          </w:rPr>
+          <w:t>interpretation contract</w:t>
+        </w:r>
+      </w:hyperlink>
+      <w:r>
+        <w:rPr>
+          <w:b w:val="0"/>
+          <w:i w:val="0"/>
+        </w:rPr>
+        <w:t>. No chi=192 is automatically scheduled.</w:t>
+      </w:r>
+    </w:p>
+    <w:tbl>
+      <w:tblPr>
+        <w:tblW w:type="auto" w:w="0"/>
+        <w:jc w:val="center"/>
+        <w:tblLayout w:type="autofit"/>
+        <w:tblLook w:firstColumn="1" w:firstRow="1" w:lastColumn="0" w:lastRow="0" w:noHBand="0" w:noVBand="1" w:val="04A0"/>
+        <w:tblBorders>
+          <w:top w:val="single" w:sz="4" w:space="0" w:color="999999"/>
+          <w:left w:val="single" w:sz="4" w:space="0" w:color="999999"/>
+          <w:bottom w:val="single" w:sz="4" w:space="0" w:color="999999"/>
+          <w:right w:val="single" w:sz="4" w:space="0" w:color="999999"/>
+          <w:insideH w:val="single" w:sz="4" w:space="0" w:color="999999"/>
+          <w:insideV w:val="single" w:sz="4" w:space="0" w:color="999999"/>
+        </w:tblBorders>
+      </w:tblPr>
+      <w:tblGrid>
+        <w:gridCol w:w="1392"/>
+        <w:gridCol w:w="1392"/>
+        <w:gridCol w:w="1392"/>
+        <w:gridCol w:w="1392"/>
+        <w:gridCol w:w="1392"/>
+        <w:gridCol w:w="1392"/>
+        <w:gridCol w:w="1392"/>
+      </w:tblGrid>
+      <w:tr>
+        <w:trPr>
+          <w:cantSplit/>
+          <w:tblHeader/>
+        </w:trPr>
+        <w:tc>
+          <w:tcPr>
+            <w:tcW w:type="dxa" w:w="1392"/>
+            <w:shd w:val="clear" w:color="auto" w:fill="E8ECF2"/>
+            <w:shd w:val="clear" w:color="auto" w:fill="E6EEF5"/>
+          </w:tcPr>
+          <w:p>
+            <w:pPr>
+              <w:spacing w:after="40"/>
+            </w:pPr>
+            <w:r>
+              <w:rPr>
+                <w:sz w:val="17"/>
+              </w:rPr>
+            </w:r>
+            <w:r>
+              <w:rPr>
+                <w:b/>
+                <w:i w:val="0"/>
+                <w:sz w:val="17"/>
+              </w:rPr>
+              <w:t>Preparation</w:t>
+            </w:r>
+          </w:p>
+        </w:tc>
+        <w:tc>
+          <w:tcPr>
+            <w:tcW w:type="dxa" w:w="1392"/>
+            <w:shd w:val="clear" w:color="auto" w:fill="E8ECF2"/>
+            <w:shd w:val="clear" w:color="auto" w:fill="E6EEF5"/>
+          </w:tcPr>
+          <w:p>
+            <w:pPr>
+              <w:spacing w:after="40"/>
+            </w:pPr>
+            <w:r>
+              <w:rPr>
+                <w:sz w:val="17"/>
+              </w:rPr>
+            </w:r>
+            <w:r>
+              <w:rPr>
+                <w:b/>
+                <w:i w:val="0"/>
+                <w:sz w:val="17"/>
+              </w:rPr>
+              <w:t>Status</w:t>
+            </w:r>
+          </w:p>
+        </w:tc>
+        <w:tc>
+          <w:tcPr>
+            <w:tcW w:type="dxa" w:w="1392"/>
+            <w:shd w:val="clear" w:color="auto" w:fill="E8ECF2"/>
+            <w:shd w:val="clear" w:color="auto" w:fill="E6EEF5"/>
+          </w:tcPr>
+          <w:p>
+            <w:pPr>
+              <w:spacing w:after="40"/>
+            </w:pPr>
+            <w:r>
+              <w:rPr>
+                <w:sz w:val="17"/>
+              </w:rPr>
+            </w:r>
+            <w:r>
+              <w:rPr>
+                <w:b/>
+                <w:i w:val="0"/>
+                <w:sz w:val="17"/>
+              </w:rPr>
+              <w:t>Optimizer residual</w:t>
+            </w:r>
+          </w:p>
+        </w:tc>
+        <w:tc>
+          <w:tcPr>
+            <w:tcW w:type="dxa" w:w="1392"/>
+            <w:shd w:val="clear" w:color="auto" w:fill="E8ECF2"/>
+            <w:shd w:val="clear" w:color="auto" w:fill="E6EEF5"/>
+          </w:tcPr>
+          <w:p>
+            <w:pPr>
+              <w:spacing w:after="40"/>
+            </w:pPr>
+            <w:r>
+              <w:rPr>
+                <w:sz w:val="17"/>
+              </w:rPr>
+            </w:r>
+            <w:r>
+              <w:rPr>
+                <w:b/>
+                <w:i w:val="0"/>
+                <w:sz w:val="17"/>
+              </w:rPr>
+              <w:t>Left / right compatibility</w:t>
+            </w:r>
+          </w:p>
+        </w:tc>
+        <w:tc>
+          <w:tcPr>
+            <w:tcW w:type="dxa" w:w="1392"/>
+            <w:shd w:val="clear" w:color="auto" w:fill="E8ECF2"/>
+            <w:shd w:val="clear" w:color="auto" w:fill="E6EEF5"/>
+          </w:tcPr>
+          <w:p>
+            <w:pPr>
+              <w:spacing w:after="40"/>
+            </w:pPr>
+            <w:r>
+              <w:rPr>
+                <w:sz w:val="17"/>
+              </w:rPr>
+            </w:r>
+            <w:r>
+              <w:rPr>
+                <w:b/>
+                <w:i w:val="0"/>
+                <w:sz w:val="17"/>
+              </w:rPr>
+              <w:t>Iterations</w:t>
+            </w:r>
+          </w:p>
+        </w:tc>
+        <w:tc>
+          <w:tcPr>
+            <w:tcW w:type="dxa" w:w="1392"/>
+            <w:shd w:val="clear" w:color="auto" w:fill="E8ECF2"/>
+            <w:shd w:val="clear" w:color="auto" w:fill="E6EEF5"/>
+          </w:tcPr>
+          <w:p>
+            <w:pPr>
+              <w:spacing w:after="40"/>
+            </w:pPr>
+            <w:r>
+              <w:rPr>
+                <w:sz w:val="17"/>
+              </w:rPr>
+            </w:r>
+            <w:r>
+              <w:rPr>
+                <w:b/>
+                <w:i w:val="0"/>
+                <w:sz w:val="17"/>
+              </w:rPr>
+              <w:t>Stage seconds</w:t>
+            </w:r>
+          </w:p>
+        </w:tc>
+        <w:tc>
+          <w:tcPr>
+            <w:tcW w:type="dxa" w:w="1392"/>
+            <w:shd w:val="clear" w:color="auto" w:fill="E8ECF2"/>
+            <w:shd w:val="clear" w:color="auto" w:fill="E6EEF5"/>
+          </w:tcPr>
+          <w:p>
+            <w:pPr>
+              <w:spacing w:after="40"/>
+            </w:pPr>
+            <w:r>
+              <w:rPr>
+                <w:sz w:val="17"/>
+              </w:rPr>
+            </w:r>
+            <w:r>
+              <w:rPr>
+                <w:b/>
+                <w:i w:val="0"/>
+                <w:sz w:val="17"/>
+              </w:rPr>
+              <w:t>f_period_Rayleigh</w:t>
+            </w:r>
+          </w:p>
+        </w:tc>
+      </w:tr>
+      <w:tr>
+        <w:trPr>
+          <w:cantSplit/>
+        </w:trPr>
+        <w:tc>
+          <w:tcPr>
+            <w:tcW w:type="dxa" w:w="1392"/>
+          </w:tcPr>
+          <w:p>
+            <w:pPr>
+              <w:spacing w:after="40"/>
+            </w:pPr>
+            <w:r>
+              <w:rPr>
+                <w:sz w:val="17"/>
+              </w:rPr>
+            </w:r>
+            <w:r>
+              <w:rPr>
+                <w:b w:val="0"/>
+                <w:i w:val="0"/>
+                <w:sz w:val="17"/>
+              </w:rPr>
+              <w:t>ordered</w:t>
+            </w:r>
+          </w:p>
+        </w:tc>
+        <w:tc>
+          <w:tcPr>
+            <w:tcW w:type="dxa" w:w="1392"/>
+          </w:tcPr>
+          <w:p>
+            <w:pPr>
+              <w:spacing w:after="40"/>
+            </w:pPr>
+            <w:r>
+              <w:rPr>
+                <w:sz w:val="17"/>
+              </w:rPr>
+            </w:r>
+            <w:r>
+              <w:rPr>
+                <w:b w:val="0"/>
+                <w:i w:val="0"/>
+                <w:sz w:val="17"/>
+              </w:rPr>
+              <w:t>accepted-stationary-at-finite-chi</w:t>
+            </w:r>
+          </w:p>
+        </w:tc>
+        <w:tc>
+          <w:tcPr>
+            <w:tcW w:type="dxa" w:w="1392"/>
+          </w:tcPr>
+          <w:p>
+            <w:pPr>
+              <w:spacing w:after="40"/>
+            </w:pPr>
+            <w:r>
+              <w:rPr>
+                <w:sz w:val="17"/>
+              </w:rPr>
+            </w:r>
+            <w:r>
+              <w:rPr>
+                <w:b w:val="0"/>
+                <w:i w:val="0"/>
+                <w:sz w:val="17"/>
+              </w:rPr>
+              <w:t>9.99e-08</w:t>
+            </w:r>
+          </w:p>
+        </w:tc>
+        <w:tc>
+          <w:tcPr>
+            <w:tcW w:type="dxa" w:w="1392"/>
+          </w:tcPr>
+          <w:p>
+            <w:pPr>
+              <w:spacing w:after="40"/>
+            </w:pPr>
+            <w:r>
+              <w:rPr>
+                <w:sz w:val="17"/>
+              </w:rPr>
+            </w:r>
+            <w:r>
+              <w:rPr>
+                <w:b w:val="0"/>
+                <w:i w:val="0"/>
+                <w:sz w:val="17"/>
+              </w:rPr>
+              <w:t>9.99e-08 / 9.99e-08</w:t>
+            </w:r>
+          </w:p>
+        </w:tc>
+        <w:tc>
+          <w:tcPr>
+            <w:tcW w:type="dxa" w:w="1392"/>
+          </w:tcPr>
+          <w:p>
+            <w:pPr>
+              <w:spacing w:after="40"/>
+            </w:pPr>
+            <w:r>
+              <w:rPr>
+                <w:sz w:val="17"/>
+              </w:rPr>
+            </w:r>
+            <w:r>
+              <w:rPr>
+                <w:b w:val="0"/>
+                <w:i w:val="0"/>
+                <w:sz w:val="17"/>
+              </w:rPr>
+              <w:t>186</w:t>
+            </w:r>
+          </w:p>
+        </w:tc>
+        <w:tc>
+          <w:tcPr>
+            <w:tcW w:type="dxa" w:w="1392"/>
+          </w:tcPr>
+          <w:p>
+            <w:pPr>
+              <w:spacing w:after="40"/>
+            </w:pPr>
+            <w:r>
+              <w:rPr>
+                <w:sz w:val="17"/>
+              </w:rPr>
+            </w:r>
+            <w:r>
+              <w:rPr>
+                <w:b w:val="0"/>
+                <w:i w:val="0"/>
+                <w:sz w:val="17"/>
+              </w:rPr>
+              <w:t>2507.1</w:t>
+            </w:r>
+          </w:p>
+        </w:tc>
+        <w:tc>
+          <w:tcPr>
+            <w:tcW w:type="dxa" w:w="1392"/>
+          </w:tcPr>
+          <w:p>
+            <w:pPr>
+              <w:spacing w:after="40"/>
+            </w:pPr>
+            <w:r>
+              <w:rPr>
+                <w:sz w:val="17"/>
+              </w:rPr>
+            </w:r>
+            <w:r>
+              <w:rPr>
+                <w:b w:val="0"/>
+                <w:i w:val="0"/>
+                <w:sz w:val="17"/>
+              </w:rPr>
+              <w:t>0.9930620839</w:t>
+            </w:r>
+          </w:p>
+        </w:tc>
+      </w:tr>
+      <w:tr>
+        <w:trPr>
+          <w:cantSplit/>
+        </w:trPr>
+        <w:tc>
+          <w:tcPr>
+            <w:tcW w:type="dxa" w:w="1392"/>
+            <w:shd w:val="clear" w:color="auto" w:fill="F5F7FA"/>
+          </w:tcPr>
+          <w:p>
+            <w:pPr>
+              <w:spacing w:after="40"/>
+            </w:pPr>
+            <w:r>
+              <w:rPr>
+                <w:sz w:val="17"/>
+              </w:rPr>
+            </w:r>
+            <w:r>
+              <w:rPr>
+                <w:b w:val="0"/>
+                <w:i w:val="0"/>
+                <w:sz w:val="17"/>
+              </w:rPr>
+              <w:t>disordered</w:t>
+            </w:r>
+          </w:p>
+        </w:tc>
+        <w:tc>
+          <w:tcPr>
+            <w:tcW w:type="dxa" w:w="1392"/>
+            <w:shd w:val="clear" w:color="auto" w:fill="F5F7FA"/>
+          </w:tcPr>
+          <w:p>
+            <w:pPr>
+              <w:spacing w:after="40"/>
+            </w:pPr>
+            <w:r>
+              <w:rPr>
+                <w:sz w:val="17"/>
+              </w:rPr>
+            </w:r>
+            <w:r>
+              <w:rPr>
+                <w:b w:val="0"/>
+                <w:i w:val="0"/>
+                <w:sz w:val="17"/>
+              </w:rPr>
+              <w:t>accepted-stationary-at-finite-chi</w:t>
+            </w:r>
+          </w:p>
+        </w:tc>
+        <w:tc>
+          <w:tcPr>
+            <w:tcW w:type="dxa" w:w="1392"/>
+            <w:shd w:val="clear" w:color="auto" w:fill="F5F7FA"/>
+          </w:tcPr>
+          <w:p>
+            <w:pPr>
+              <w:spacing w:after="40"/>
+            </w:pPr>
+            <w:r>
+              <w:rPr>
+                <w:sz w:val="17"/>
+              </w:rPr>
+            </w:r>
+            <w:r>
+              <w:rPr>
+                <w:b w:val="0"/>
+                <w:i w:val="0"/>
+                <w:sz w:val="17"/>
+              </w:rPr>
+              <w:t>9.57e-08</w:t>
+            </w:r>
+          </w:p>
+        </w:tc>
+        <w:tc>
+          <w:tcPr>
+            <w:tcW w:type="dxa" w:w="1392"/>
+            <w:shd w:val="clear" w:color="auto" w:fill="F5F7FA"/>
+          </w:tcPr>
+          <w:p>
+            <w:pPr>
+              <w:spacing w:after="40"/>
+            </w:pPr>
+            <w:r>
+              <w:rPr>
+                <w:sz w:val="17"/>
+              </w:rPr>
+            </w:r>
+            <w:r>
+              <w:rPr>
+                <w:b w:val="0"/>
+                <w:i w:val="0"/>
+                <w:sz w:val="17"/>
+              </w:rPr>
+              <w:t>9.57e-08 / 9.57e-08</w:t>
+            </w:r>
+          </w:p>
+        </w:tc>
+        <w:tc>
+          <w:tcPr>
+            <w:tcW w:type="dxa" w:w="1392"/>
+            <w:shd w:val="clear" w:color="auto" w:fill="F5F7FA"/>
+          </w:tcPr>
+          <w:p>
+            <w:pPr>
+              <w:spacing w:after="40"/>
+            </w:pPr>
+            <w:r>
+              <w:rPr>
+                <w:sz w:val="17"/>
+              </w:rPr>
+            </w:r>
+            <w:r>
+              <w:rPr>
+                <w:b w:val="0"/>
+                <w:i w:val="0"/>
+                <w:sz w:val="17"/>
+              </w:rPr>
+              <w:t>79</w:t>
+            </w:r>
+          </w:p>
+        </w:tc>
+        <w:tc>
+          <w:tcPr>
+            <w:tcW w:type="dxa" w:w="1392"/>
+            <w:shd w:val="clear" w:color="auto" w:fill="F5F7FA"/>
+          </w:tcPr>
+          <w:p>
+            <w:pPr>
+              <w:spacing w:after="40"/>
+            </w:pPr>
+            <w:r>
+              <w:rPr>
+                <w:sz w:val="17"/>
+              </w:rPr>
+            </w:r>
+            <w:r>
+              <w:rPr>
+                <w:b w:val="0"/>
+                <w:i w:val="0"/>
+                <w:sz w:val="17"/>
+              </w:rPr>
+              <w:t>1022.8</w:t>
+            </w:r>
+          </w:p>
+        </w:tc>
+        <w:tc>
+          <w:tcPr>
+            <w:tcW w:type="dxa" w:w="1392"/>
+            <w:shd w:val="clear" w:color="auto" w:fill="F5F7FA"/>
+          </w:tcPr>
+          <w:p>
+            <w:pPr>
+              <w:spacing w:after="40"/>
+            </w:pPr>
+            <w:r>
+              <w:rPr>
+                <w:sz w:val="17"/>
+              </w:rPr>
+            </w:r>
+            <w:r>
+              <w:rPr>
+                <w:b w:val="0"/>
+                <w:i w:val="0"/>
+                <w:sz w:val="17"/>
+              </w:rPr>
+              <w:t>0.9930620802</w:t>
+            </w:r>
+          </w:p>
+        </w:tc>
+      </w:tr>
+    </w:tbl>
+    <w:p>
+      <w:pPr>
+        <w:spacing w:after="80"/>
+      </w:pPr>
+    </w:p>
+    <w:p>
+      <w:r>
+        <w:rPr>
+          <w:b w:val="0"/>
+          <w:i w:val="0"/>
+        </w:rPr>
+        <w:t>Neither agreement nor disagreement at one rate and chi is a binary order test. The earlier chi=96 optimizer failures do not establish two stationary phases and are not assigned additional phase-order evidence. A controlled stationary-branch rate bracket and chi/size-systematic checks remain necessary. Non-converged partial states are not substituted for an accepted pair.</w:t>
+      </w:r>
+    </w:p>
+    <w:p>
+      <w:r>
+        <w:rPr>
+          <w:b w:val="0"/>
+          <w:i w:val="0"/>
+        </w:rPr>
+        <w:t xml:space="preserve">Supplementary symmetry/gauge-aware comparison: </w:t>
+      </w:r>
+      <w:r>
+        <w:rPr>
+          <w:b/>
+          <w:i w:val="0"/>
+        </w:rPr>
+        <w:t>all 36 symmetry orientations evaluated</w:t>
+      </w:r>
+      <w:r>
+        <w:rPr>
+          <w:b w:val="0"/>
+          <w:i w:val="0"/>
+        </w:rPr>
+        <w:t xml:space="preserve">, 36 orientations. Largest evaluated normalized mixed-transfer fidelity per site: </w:t>
+      </w:r>
+      <w:r>
+        <w:rPr>
+          <w:b/>
+          <w:i w:val="0"/>
+        </w:rPr>
+        <w:t>0.9999994886</w:t>
+      </w:r>
+      <w:r>
+        <w:rPr>
+          <w:b w:val="0"/>
+          <w:i w:val="0"/>
+        </w:rPr>
+        <w:t xml:space="preserve">. This is a per-site similarity diagnostic, not proof of exact state identity or phase order. Raw complex eigenvalues and contraction residuals are retained in </w:t>
+      </w:r>
+      <w:r>
+        <w:rPr>
+          <w:rFonts w:ascii="Consolas" w:hAnsi="Consolas" w:eastAsia="Consolas" w:cs="Consolas"/>
+          <w:b w:val="0"/>
+          <w:i w:val="0"/>
+        </w:rPr>
+        <w:t>n3_chi128_stationary_comparison.json</w:t>
+      </w:r>
+      <w:r>
+        <w:rPr>
+          <w:b w:val="0"/>
+          <w:i w:val="0"/>
+        </w:rPr>
+        <w:t>.</w:t>
+      </w:r>
+    </w:p>
+    <w:p>
+      <w:pPr>
+        <w:pStyle w:val="Heading3"/>
+      </w:pPr>
+      <w:r>
+        <w:rPr>
+          <w:b w:val="0"/>
+          <w:i w:val="0"/>
+        </w:rPr>
+        <w:t>Independent period-Rayleigh functional checks</w:t>
+      </w:r>
+    </w:p>
+    <w:tbl>
+      <w:tblPr>
+        <w:tblW w:type="auto" w:w="0"/>
+        <w:jc w:val="center"/>
+        <w:tblLayout w:type="autofit"/>
+        <w:tblLook w:firstColumn="1" w:firstRow="1" w:lastColumn="0" w:lastRow="0" w:noHBand="0" w:noVBand="1" w:val="04A0"/>
+        <w:tblBorders>
+          <w:top w:val="single" w:sz="4" w:space="0" w:color="999999"/>
+          <w:left w:val="single" w:sz="4" w:space="0" w:color="999999"/>
+          <w:bottom w:val="single" w:sz="4" w:space="0" w:color="999999"/>
+          <w:right w:val="single" w:sz="4" w:space="0" w:color="999999"/>
+          <w:insideH w:val="single" w:sz="4" w:space="0" w:color="999999"/>
+          <w:insideV w:val="single" w:sz="4" w:space="0" w:color="999999"/>
+        </w:tblBorders>
+      </w:tblPr>
+      <w:tblGrid>
+        <w:gridCol w:w="1624"/>
+        <w:gridCol w:w="1624"/>
+        <w:gridCol w:w="1624"/>
+        <w:gridCol w:w="1624"/>
+        <w:gridCol w:w="1624"/>
+        <w:gridCol w:w="1624"/>
+      </w:tblGrid>
+      <w:tr>
+        <w:trPr>
+          <w:cantSplit/>
+          <w:tblHeader/>
+        </w:trPr>
+        <w:tc>
+          <w:tcPr>
+            <w:tcW w:type="dxa" w:w="1624"/>
+            <w:shd w:val="clear" w:color="auto" w:fill="E8ECF2"/>
+            <w:shd w:val="clear" w:color="auto" w:fill="E6EEF5"/>
+          </w:tcPr>
+          <w:p>
+            <w:pPr>
+              <w:spacing w:after="40"/>
+            </w:pPr>
+            <w:r>
+              <w:rPr>
+                <w:sz w:val="17"/>
+              </w:rPr>
+            </w:r>
+            <w:r>
+              <w:rPr>
+                <w:b/>
+                <w:i w:val="0"/>
+                <w:sz w:val="17"/>
+              </w:rPr>
+              <w:t>Preparation</w:t>
+            </w:r>
+          </w:p>
+        </w:tc>
+        <w:tc>
+          <w:tcPr>
+            <w:tcW w:type="dxa" w:w="1624"/>
+            <w:shd w:val="clear" w:color="auto" w:fill="E8ECF2"/>
+            <w:shd w:val="clear" w:color="auto" w:fill="E6EEF5"/>
+          </w:tcPr>
+          <w:p>
+            <w:pPr>
+              <w:spacing w:after="40"/>
+            </w:pPr>
+            <w:r>
+              <w:rPr>
+                <w:sz w:val="17"/>
+              </w:rPr>
+            </w:r>
+            <w:r>
+              <w:rPr>
+                <w:b/>
+                <w:i w:val="0"/>
+                <w:sz w:val="17"/>
+              </w:rPr>
+              <w:t>p</w:t>
+            </w:r>
+          </w:p>
+        </w:tc>
+        <w:tc>
+          <w:tcPr>
+            <w:tcW w:type="dxa" w:w="1624"/>
+            <w:shd w:val="clear" w:color="auto" w:fill="E8ECF2"/>
+            <w:shd w:val="clear" w:color="auto" w:fill="E6EEF5"/>
+          </w:tcPr>
+          <w:p>
+            <w:pPr>
+              <w:spacing w:after="40"/>
+            </w:pPr>
+            <w:r>
+              <w:rPr>
+                <w:sz w:val="17"/>
+              </w:rPr>
+            </w:r>
+            <w:r>
+              <w:rPr>
+                <w:b/>
+                <w:i w:val="0"/>
+                <w:sz w:val="17"/>
+              </w:rPr>
+              <w:t>chi</w:t>
+            </w:r>
+          </w:p>
+        </w:tc>
+        <w:tc>
+          <w:tcPr>
+            <w:tcW w:type="dxa" w:w="1624"/>
+            <w:shd w:val="clear" w:color="auto" w:fill="E8ECF2"/>
+            <w:shd w:val="clear" w:color="auto" w:fill="E6EEF5"/>
+          </w:tcPr>
+          <w:p>
+            <w:pPr>
+              <w:spacing w:after="40"/>
+            </w:pPr>
+            <w:r>
+              <w:rPr>
+                <w:sz w:val="17"/>
+              </w:rPr>
+            </w:r>
+            <w:r>
+              <w:rPr>
+                <w:b/>
+                <w:i w:val="0"/>
+                <w:sz w:val="17"/>
+              </w:rPr>
+              <w:t>f_half</w:t>
+            </w:r>
+          </w:p>
+        </w:tc>
+        <w:tc>
+          <w:tcPr>
+            <w:tcW w:type="dxa" w:w="1624"/>
+            <w:shd w:val="clear" w:color="auto" w:fill="E8ECF2"/>
+            <w:shd w:val="clear" w:color="auto" w:fill="E6EEF5"/>
+          </w:tcPr>
+          <w:p>
+            <w:pPr>
+              <w:spacing w:after="40"/>
+            </w:pPr>
+            <w:r>
+              <w:rPr>
+                <w:sz w:val="17"/>
+              </w:rPr>
+            </w:r>
+            <w:r>
+              <w:rPr>
+                <w:b/>
+                <w:i w:val="0"/>
+                <w:sz w:val="17"/>
+              </w:rPr>
+              <w:t>f_period_Rayleigh</w:t>
+            </w:r>
+          </w:p>
+        </w:tc>
+        <w:tc>
+          <w:tcPr>
+            <w:tcW w:type="dxa" w:w="1624"/>
+            <w:shd w:val="clear" w:color="auto" w:fill="E8ECF2"/>
+            <w:shd w:val="clear" w:color="auto" w:fill="E6EEF5"/>
+          </w:tcPr>
+          <w:p>
+            <w:pPr>
+              <w:spacing w:after="40"/>
+            </w:pPr>
+            <w:r>
+              <w:rPr>
+                <w:sz w:val="17"/>
+              </w:rPr>
+            </w:r>
+            <w:r>
+              <w:rPr>
+                <w:b/>
+                <w:i w:val="0"/>
+                <w:sz w:val="17"/>
+              </w:rPr>
+              <w:t>difference</w:t>
+            </w:r>
+          </w:p>
+        </w:tc>
+      </w:tr>
+      <w:tr>
+        <w:trPr>
+          <w:cantSplit/>
+        </w:trPr>
+        <w:tc>
+          <w:tcPr>
+            <w:tcW w:type="dxa" w:w="1624"/>
+          </w:tcPr>
+          <w:p>
+            <w:pPr>
+              <w:spacing w:after="40"/>
+            </w:pPr>
+            <w:r>
+              <w:rPr>
+                <w:sz w:val="17"/>
+              </w:rPr>
+            </w:r>
+            <w:r>
+              <w:rPr>
+                <w:b w:val="0"/>
+                <w:i w:val="0"/>
+                <w:sz w:val="17"/>
+              </w:rPr>
+              <w:t>disordered</w:t>
+            </w:r>
+          </w:p>
+        </w:tc>
+        <w:tc>
+          <w:tcPr>
+            <w:tcW w:type="dxa" w:w="1624"/>
+          </w:tcPr>
+          <w:p>
+            <w:pPr>
+              <w:spacing w:after="40"/>
+            </w:pPr>
+            <w:r>
+              <w:rPr>
+                <w:sz w:val="17"/>
+              </w:rPr>
+            </w:r>
+            <w:r>
+              <w:rPr>
+                <w:b w:val="0"/>
+                <w:i w:val="0"/>
+                <w:sz w:val="17"/>
+              </w:rPr>
+              <w:t>0.3048600</w:t>
+            </w:r>
+          </w:p>
+        </w:tc>
+        <w:tc>
+          <w:tcPr>
+            <w:tcW w:type="dxa" w:w="1624"/>
+          </w:tcPr>
+          <w:p>
+            <w:pPr>
+              <w:spacing w:after="40"/>
+            </w:pPr>
+            <w:r>
+              <w:rPr>
+                <w:sz w:val="17"/>
+              </w:rPr>
+            </w:r>
+            <w:r>
+              <w:rPr>
+                <w:b w:val="0"/>
+                <w:i w:val="0"/>
+                <w:sz w:val="17"/>
+              </w:rPr>
+              <w:t>128</w:t>
+            </w:r>
+          </w:p>
+        </w:tc>
+        <w:tc>
+          <w:tcPr>
+            <w:tcW w:type="dxa" w:w="1624"/>
+          </w:tcPr>
+          <w:p>
+            <w:pPr>
+              <w:spacing w:after="40"/>
+            </w:pPr>
+            <w:r>
+              <w:rPr>
+                <w:sz w:val="17"/>
+              </w:rPr>
+            </w:r>
+            <w:r>
+              <w:rPr>
+                <w:b w:val="0"/>
+                <w:i w:val="0"/>
+                <w:sz w:val="17"/>
+              </w:rPr>
+              <w:t>0.9930622737</w:t>
+            </w:r>
+          </w:p>
+        </w:tc>
+        <w:tc>
+          <w:tcPr>
+            <w:tcW w:type="dxa" w:w="1624"/>
+          </w:tcPr>
+          <w:p>
+            <w:pPr>
+              <w:spacing w:after="40"/>
+            </w:pPr>
+            <w:r>
+              <w:rPr>
+                <w:sz w:val="17"/>
+              </w:rPr>
+            </w:r>
+            <w:r>
+              <w:rPr>
+                <w:b w:val="0"/>
+                <w:i w:val="0"/>
+                <w:sz w:val="17"/>
+              </w:rPr>
+              <w:t>0.9930620802</w:t>
+            </w:r>
+          </w:p>
+        </w:tc>
+        <w:tc>
+          <w:tcPr>
+            <w:tcW w:type="dxa" w:w="1624"/>
+          </w:tcPr>
+          <w:p>
+            <w:pPr>
+              <w:spacing w:after="40"/>
+            </w:pPr>
+            <w:r>
+              <w:rPr>
+                <w:sz w:val="17"/>
+              </w:rPr>
+            </w:r>
+            <w:r>
+              <w:rPr>
+                <w:b w:val="0"/>
+                <w:i w:val="0"/>
+                <w:sz w:val="17"/>
+              </w:rPr>
+              <w:t>1.935e-07</w:t>
+            </w:r>
+          </w:p>
+        </w:tc>
+      </w:tr>
+      <w:tr>
+        <w:trPr>
+          <w:cantSplit/>
+        </w:trPr>
+        <w:tc>
+          <w:tcPr>
+            <w:tcW w:type="dxa" w:w="1624"/>
+            <w:shd w:val="clear" w:color="auto" w:fill="F5F7FA"/>
+          </w:tcPr>
+          <w:p>
+            <w:pPr>
+              <w:spacing w:after="40"/>
+            </w:pPr>
+            <w:r>
+              <w:rPr>
+                <w:sz w:val="17"/>
+              </w:rPr>
+            </w:r>
+            <w:r>
+              <w:rPr>
+                <w:b w:val="0"/>
+                <w:i w:val="0"/>
+                <w:sz w:val="17"/>
+              </w:rPr>
+              <w:t>ordered</w:t>
+            </w:r>
+          </w:p>
+        </w:tc>
+        <w:tc>
+          <w:tcPr>
+            <w:tcW w:type="dxa" w:w="1624"/>
+            <w:shd w:val="clear" w:color="auto" w:fill="F5F7FA"/>
+          </w:tcPr>
+          <w:p>
+            <w:pPr>
+              <w:spacing w:after="40"/>
+            </w:pPr>
+            <w:r>
+              <w:rPr>
+                <w:sz w:val="17"/>
+              </w:rPr>
+            </w:r>
+            <w:r>
+              <w:rPr>
+                <w:b w:val="0"/>
+                <w:i w:val="0"/>
+                <w:sz w:val="17"/>
+              </w:rPr>
+              <w:t>0.3048600</w:t>
+            </w:r>
+          </w:p>
+        </w:tc>
+        <w:tc>
+          <w:tcPr>
+            <w:tcW w:type="dxa" w:w="1624"/>
+            <w:shd w:val="clear" w:color="auto" w:fill="F5F7FA"/>
+          </w:tcPr>
+          <w:p>
+            <w:pPr>
+              <w:spacing w:after="40"/>
+            </w:pPr>
+            <w:r>
+              <w:rPr>
+                <w:sz w:val="17"/>
+              </w:rPr>
+            </w:r>
+            <w:r>
+              <w:rPr>
+                <w:b w:val="0"/>
+                <w:i w:val="0"/>
+                <w:sz w:val="17"/>
+              </w:rPr>
+              <w:t>128</w:t>
+            </w:r>
+          </w:p>
+        </w:tc>
+        <w:tc>
+          <w:tcPr>
+            <w:tcW w:type="dxa" w:w="1624"/>
+            <w:shd w:val="clear" w:color="auto" w:fill="F5F7FA"/>
+          </w:tcPr>
+          <w:p>
+            <w:pPr>
+              <w:spacing w:after="40"/>
+            </w:pPr>
+            <w:r>
+              <w:rPr>
+                <w:sz w:val="17"/>
+              </w:rPr>
+            </w:r>
+            <w:r>
+              <w:rPr>
+                <w:b w:val="0"/>
+                <w:i w:val="0"/>
+                <w:sz w:val="17"/>
+              </w:rPr>
+              <w:t>0.9930622853</w:t>
+            </w:r>
+          </w:p>
+        </w:tc>
+        <w:tc>
+          <w:tcPr>
+            <w:tcW w:type="dxa" w:w="1624"/>
+            <w:shd w:val="clear" w:color="auto" w:fill="F5F7FA"/>
+          </w:tcPr>
+          <w:p>
+            <w:pPr>
+              <w:spacing w:after="40"/>
+            </w:pPr>
+            <w:r>
+              <w:rPr>
+                <w:sz w:val="17"/>
+              </w:rPr>
+            </w:r>
+            <w:r>
+              <w:rPr>
+                <w:b w:val="0"/>
+                <w:i w:val="0"/>
+                <w:sz w:val="17"/>
+              </w:rPr>
+              <w:t>0.9930620839</w:t>
+            </w:r>
+          </w:p>
+        </w:tc>
+        <w:tc>
+          <w:tcPr>
+            <w:tcW w:type="dxa" w:w="1624"/>
+            <w:shd w:val="clear" w:color="auto" w:fill="F5F7FA"/>
+          </w:tcPr>
+          <w:p>
+            <w:pPr>
+              <w:spacing w:after="40"/>
+            </w:pPr>
+            <w:r>
+              <w:rPr>
+                <w:sz w:val="17"/>
+              </w:rPr>
+            </w:r>
+            <w:r>
+              <w:rPr>
+                <w:b w:val="0"/>
+                <w:i w:val="0"/>
+                <w:sz w:val="17"/>
+              </w:rPr>
+              <w:t>2.013e-07</w:t>
+            </w:r>
+          </w:p>
+        </w:tc>
+      </w:tr>
+    </w:tbl>
+    <w:p>
+      <w:pPr>
+        <w:spacing w:after="80"/>
+      </w:pPr>
     </w:p>
     <w:p>
       <w:pPr>
@@ -4703,7 +6600,7 @@
         </w:rPr>
         <w:t xml:space="preserve">, not finely root-solved values and not thermodynamic critical points. The maximum absolute stored eigenpair residual is 1.17e-10. The finite-size Haar/Clifford difference is resolved; a thermodynamic critical-point split is not established. See </w:t>
       </w:r>
-      <w:hyperlink r:id="rId14">
+      <w:hyperlink r:id="rId16">
         <w:r>
           <w:rPr>
             <w:color w:val="176A9E"/>
@@ -4719,7 +6616,7 @@
         </w:rPr>
         <w:t xml:space="preserve"> and </w:t>
       </w:r>
-      <w:hyperlink r:id="rId15">
+      <w:hyperlink r:id="rId17">
         <w:r>
           <w:rPr>
             <w:color w:val="176A9E"/>
@@ -7248,7 +9145,7 @@
                 <w:i w:val="0"/>
                 <w:sz w:val="17"/>
               </w:rPr>
-              <w:t>accepted new half-row observations through chi=96; 0 accepted same-rate/same-chi pair(s); inspect nonconverged and partial states</w:t>
+              <w:t>accepted new half-row observations through chi=128; 1 accepted same-rate/same-chi pair(s); inspect nonconverged and partial states</w:t>
             </w:r>
           </w:p>
         </w:tc>
@@ -7871,7 +9768,7 @@
         </w:rPr>
         <w:t xml:space="preserve">The chosen method has been implemented and feasible computations executed, but unfinished mathematical and large-size jobs are not represented as complete. Missing boundary-contract, mixing or analytic-hypothesis prerequisites remain explicit. See </w:t>
       </w:r>
-      <w:hyperlink r:id="rId16">
+      <w:hyperlink r:id="rId18">
         <w:r>
           <w:rPr>
             <w:color w:val="176A9E"/>
@@ -7944,7 +9841,7 @@
           <w:b w:val="0"/>
           <w:i w:val="0"/>
         </w:rPr>
-        <w:t>v2.2/verify/run_all_transition_2026-10-16-final.log</w:t>
+        <w:t>v2.2/verify/run_all_chi128_2026-10-16.log</w:t>
       </w:r>
       <w:r>
         <w:rPr>
@@ -7960,7 +9857,7 @@
           <w:b w:val="0"/>
           <w:i w:val="0"/>
         </w:rPr>
-        <w:t xml:space="preserve">The first ordinary GitHub push was verified at commit </w:t>
+        <w:t xml:space="preserve">The previous verified remote commit is </w:t>
       </w:r>
       <w:r>
         <w:rPr>
@@ -7968,7 +9865,7 @@
           <w:b w:val="0"/>
           <w:i w:val="0"/>
         </w:rPr>
-        <w:t>b121f258cabab2c28dce4d08d74a731f8a217ad4</w:t>
+        <w:t>3b6571dc1a96f673f8c1c6a2417b0f7b03777b09</w:t>
       </w:r>
       <w:r>
         <w:rPr>
@@ -7990,7 +9887,21 @@
           <w:b w:val="0"/>
           <w:i w:val="0"/>
         </w:rPr>
-        <w:t xml:space="preserve">. The final delivery includes this report as a non-force follow-up snapshot; the exact verified final commit is supplied in the completion message. Existing history/license are preserved. Credentials are excluded and nested archive contents are scanned before staging. See </w:t>
+        <w:t xml:space="preserve">. The new chi=128 continuation is </w:t>
+      </w:r>
+      <w:r>
+        <w:rPr>
+          <w:b/>
+          <w:i w:val="0"/>
+        </w:rPr>
+        <w:t>not claimed pushed</w:t>
+      </w:r>
+      <w:r>
+        <w:rPr>
+          <w:b w:val="0"/>
+          <w:i w:val="0"/>
+        </w:rPr>
+        <w:t xml:space="preserve">: the earlier excluded credential metadata was not retained in the restored workspace. A credential-free Git bundle provides an owner-push handoff if authenticated publication remains unavailable. Existing history/license are preserved; credentials are excluded and nested archives are scanned before staging. This is a publication-status receipt, not a numerical qualification. See </w:t>
       </w:r>
       <w:r>
         <w:rPr>
@@ -8032,8 +9943,8 @@
       </w:r>
     </w:p>
     <w:sectPr>
-      <w:headerReference w:type="default" r:id="rId17"/>
-      <w:footerReference w:type="default" r:id="rId18"/>
+      <w:headerReference w:type="default" r:id="rId19"/>
+      <w:footerReference w:type="default" r:id="rId20"/>
       <w:pgSz w:w="11906" w:h="16838"/>
       <w:pgMar w:top="1134" w:right="1020" w:bottom="1134" w:left="1020" w:header="720" w:footer="720" w:gutter="0"/>
       <w:cols w:space="720"/>

</xml_diff>